<commit_message>
cap nhat phieu thuc hanh
</commit_message>
<xml_diff>
--- a/N24DCDT040_MaiDangKhoa_Phieu_Julia.docx
+++ b/N24DCDT040_MaiDangKhoa_Phieu_Julia.docx
@@ -6,6 +6,7 @@
       <w:pPr>
         <w:pStyle w:val="Heading1"/>
         <w:keepLines/>
+        <w:spacing w:after="120" w:line="252" w:lineRule="auto"/>
       </w:pPr>
       <w:r>
         <w:t>PHIẾU THỰC HÀNH — 09/10/2026</w:t>
@@ -14,6 +15,7 @@
     <w:p>
       <w:pPr>
         <w:keepLines/>
+        <w:spacing w:after="120" w:line="252" w:lineRule="auto"/>
       </w:pPr>
       <w:r>
         <w:t>Họ tên: Mai Đăng Khoa    MSSV: N24DCDT040    Lớp: D24CQDT01-N</w:t>
@@ -22,8 +24,12 @@
     <w:p>
       <w:pPr>
         <w:keepLines/>
+        <w:spacing w:after="120" w:line="252" w:lineRule="auto"/>
       </w:pPr>
       <w:r>
+        <w:rPr>
+          <w:sz w:val="21"/>
+        </w:rPr>
         <w:t>GitHub: https://github.com/MaiDangKhoaN24DCDT040/N24DCDT040_ThucHanh_Julia</w:t>
         <w:br/>
         <w:t>Commit SHA: 10157e49769a119991becf629f9cb45fc2e650f9</w:t>
@@ -34,6 +40,7 @@
         <w:pStyle w:val="Heading2"/>
         <w:keepNext/>
         <w:keepLines/>
+        <w:spacing w:after="120" w:line="252" w:lineRule="auto"/>
       </w:pPr>
       <w:r>
         <w:t>1. Mô tả một luồng ứng dụng</w:t>
@@ -42,6 +49,7 @@
     <w:p>
       <w:pPr>
         <w:keepLines/>
+        <w:spacing w:after="120" w:line="252" w:lineRule="auto"/>
       </w:pPr>
       <w:r>
         <w:t>Ghi mục tiêu, đầu vào, đầu ra và sơ đồ truyền dữ liệu giữa các chức năng.</w:t>
@@ -50,13 +58,16 @@
     <w:p>
       <w:pPr>
         <w:keepLines/>
+        <w:spacing w:after="120" w:line="252" w:lineRule="auto"/>
       </w:pPr>
       <w:r>
-        <w:t>Mục tiêu: chọn các đơn có tổng lợi ích lớn nhất trong ngân sách B, mỗi đơn chỉ chọn một lần. Đầu vào: don_hang.csv (ID, điểm giao, phục vụ, lợi ích), ban_do.csv (cạnh u,v) và B = 8 của MINI001. Đầu ra: tập chọn, tuyến, chi phí, trạng thái giao và ket_qua.csv.</w:t>
+        <w:t>Bài toán yêu cầu lập kế hoạch giao đơn sao cho tổng lợi ích lớn nhất nhưng tổng thời gian không vượt ngân sách B. Mỗi đơn được chọn tối đa một lần và thực hiện bằng một chuyến riêng: kho 1 → điểm giao → kho 1. Với h cạnh trên đường ngắn nhất và thời gian phục vụ s, chi phí của đơn là τ = 2h + s.</w:t>
         <w:br/>
-        <w:t>Luồng: đọc CSV → sắp danh mục theo ID/tra cứu → BFS từ kho 1 → tính chi phí τ = 2h + s → sắp ưu tiên và chọn bằng DP → FIFO giao đơn/ngăn xếp hoàn tác → xuất CSV. BST tra cứu cùng danh mục; danh sách liên kết giữ kế hoạch.</w:t>
+        <w:t>Dữ liệu gồm don_hang.csv (id, diem_giao, thoi_gian_phuc_vu, loi_ich) và ban_do.csv (u,v). Order lưu một đơn; danh mục tăng theo ID dùng để tra cứu. Hai cấu trúc costs và routes liên kết ID/đỉnh với chi phí và tuyến tương ứng.</w:t>
         <w:br/>
-        <w:t>Phạm vi phiếu: truy vết MINI001 và kết quả chạy thực tế trên Windows 11, Julia 1.12.7. Đã hoàn thiện bốn hàm, chạy các pha kiểm thử và xuất CSV; dữ liệu cá nhân dùng MSSV N24DCDT040.</w:t>
+        <w:t>Luồng thực hiện: CSV → merge_sort sắp danh mục → binary_search tra ID → bfs_routes tìm đường và tính costs → knapsack chọn tập đơn → lập danh sách giao → FIFO giao đơn, Stack hoàn tác → ket_qua.csv. BST hỗ trợ tra cứu; danh sách liên kết lưu kế hoạch.</w:t>
+        <w:br/>
+        <w:t>Em kiểm chứng luồng trên MINI001 với B = 8, sau đó chạy bộ cá nhân N24DCDT040 với 8 đơn, B = 28. Môi trường: Windows 11, Julia 1.12.7. Lệnh chuẩn bị mẫu: julia TH_2026_10_09_Sinh_vien.jl --data.</w:t>
       </w:r>
     </w:p>
     <w:p>
@@ -64,6 +75,7 @@
         <w:pStyle w:val="Heading2"/>
         <w:keepNext/>
         <w:keepLines/>
+        <w:spacing w:after="120" w:line="252" w:lineRule="auto"/>
       </w:pPr>
       <w:r>
         <w:t>2. Bảng truy vết đường và thời gian</w:t>
@@ -258,6 +270,7 @@
         <w:pStyle w:val="Heading2"/>
         <w:keepNext/>
         <w:keepLines/>
+        <w:spacing w:after="120" w:line="252" w:lineRule="auto"/>
       </w:pPr>
       <w:r>
         <w:t>3. Minh chứng bốn hàm</w:t>
@@ -268,6 +281,7 @@
         <w:pStyle w:val="Heading3"/>
         <w:keepNext/>
         <w:keepLines/>
+        <w:spacing w:after="120" w:line="252" w:lineRule="auto"/>
       </w:pPr>
       <w:r>
         <w:t>NV1 · Hoàn thiện merge_sort(a, before)</w:t>
@@ -276,26 +290,31 @@
     <w:p>
       <w:pPr>
         <w:keepLines/>
+        <w:spacing w:after="120" w:line="252" w:lineRule="auto"/>
       </w:pPr>
       <w:r>
-        <w:t>Ý tưởng/điều kiện áp dụng: Chia dãy thành hai nửa, đệ quy sắp từng nửa rồi trộn. Dừng khi có không quá một phần tử và trả bản sao. Khi hai khóa hòa, lấy phần tử bên trái trước; chép đủ phần dư. Comparator phải nhất quán, không dùng sort/sort! và không sửa đầu vào. Truy vết: [3,1,2] → [3] và [1,2] → trộn thành [1,2,3].</w:t>
+        <w:t>Cách thực hiện: Hàm nhận dãy a và hàm so sánh before, trả một dãy mới đã sắp. Dãy có 0 hoặc 1 phần tử là trường hợp dừng; các dãy dài hơn được chia đôi và sắp đệ quy. Khi trộn, chỉ lấy phần tử bên phải trước nếu before(right[j], left[i]) đúng; trường hợp hòa lấy bên trái để giữ thứ tự ban đầu. Sau đó chép phần còn lại của mỗi nửa. Không gọi sort/sort! và không ghi đè a.</w:t>
+        <w:br/>
+        <w:t>Ví dụ minh họa: [4,2,3,1] → [4,2] và [3,1] → [2,4] và [1,3] → [1,2,3,4]. Comparator phải mô tả một thứ tự nhất quán.</w:t>
       </w:r>
     </w:p>
     <w:p>
       <w:pPr>
         <w:keepNext/>
         <w:keepLines/>
+        <w:spacing w:after="120" w:line="252" w:lineRule="auto"/>
       </w:pPr>
       <w:r>
-        <w:t>Lời gọi và kết quả kiểm thử: merge_sort([3,1,2], (&lt;)); kỳ vọng [1,2,3]. Kiểm tra thêm dãy rỗng, một phần tử, khóa trùng, comparator giảm và tính ổn định. Lệnh: julia TH_2026_10_09_Kiem_thu.jl --phase=sort. Thực tế: đạt 8/8 phép kiểm tra.</w:t>
+        <w:t>Kiểm chứng: pha sort đạt 8/8 phép kiểm tra, gồm các tình huống biên và tính ổn định của phép trộn. Ví dụ trên là truy vết minh họa; kết quả chạy bộ kiểm thử được lưu trong ket_qua_kiem_thu.txt. Lệnh chạy được tổng hợp ở mục 6.</w:t>
       </w:r>
     </w:p>
     <w:p>
       <w:pPr>
         <w:keepLines/>
+        <w:spacing w:after="120" w:line="252" w:lineRule="auto"/>
       </w:pPr>
       <w:r>
-        <w:t>Chi phí thời gian/bộ nhớ: O(n log n) thời gian. Hiện thực đệ quy bằng lát cắt và tạo dãy kết quả mới ở mỗi lần trộn; bộ nhớ sống đồng thời O(n), ngăn xếp O(log n), tổng lượng cấp phát qua các mức O(n log n).</w:t>
+        <w:t>Phân tích: Mỗi mức đệ quy trộn tổng cộng n phần tử và có O(log n) mức, nên thời gian là O(n log n). Mã dùng lát cắt và dãy kết quả mới: bộ nhớ sống đồng thời O(n), ngăn xếp O(log n); tổng lượng cấp phát qua toàn bộ quá trình là O(n log n).</w:t>
       </w:r>
     </w:p>
     <w:p>
@@ -303,6 +322,7 @@
         <w:pStyle w:val="Heading3"/>
         <w:keepNext/>
         <w:keepLines/>
+        <w:spacing w:after="120" w:line="252" w:lineRule="auto"/>
       </w:pPr>
       <w:r>
         <w:t>NV2 · Hoàn thiện binary_search(a::Vector{Order}, id::Int)</w:t>
@@ -311,26 +331,536 @@
     <w:p>
       <w:pPr>
         <w:keepLines/>
+        <w:spacing w:after="120" w:line="252" w:lineRule="auto"/>
       </w:pPr>
       <w:r>
-        <w:t>Ý tưởng/điều kiện áp dụng: Dãy Order phải tăng theo ID, các ID duy nhất. Đặt left = 1, right = n; khi left ≤ right, tính mid = left + (right − left) ÷ 2. So sánh a[mid].id; khớp thì trả Order, nhỏ hơn thì left = mid + 1, lớn hơn thì right = mid − 1. Hết khoảng trả nothing; không thay dữ liệu.</w:t>
+        <w:t>Cách thực hiện: binary_search nhận danh mục Order tăng theo ID và khóa id cần tìm. Hai biến left, right giới hạn vùng còn khả năng chứa khóa; mid = left + (right − left) ÷ 2. Nếu a[mid].id nhỏ hơn khóa, bỏ nửa trái; nếu lớn hơn, bỏ nửa phải. Khi bằng nhau, trả bản ghi Order. Vòng lặp dừng khi left &gt; right và trả nothing. Việc loại nửa khoảng chỉ hợp lệ khi danh mục tăng theo ID; các ID trong bài là duy nhất.</w:t>
       </w:r>
     </w:p>
     <w:p>
       <w:pPr>
         <w:keepNext/>
         <w:keepLines/>
+        <w:spacing w:after="120" w:line="252" w:lineRule="auto"/>
       </w:pPr>
       <w:r>
-        <w:t>Lời gọi và kết quả kiểm thử: binary_search(by_id,2) kỳ vọng Order(2,4,1,8); ID 99 và dãy rỗng trả nothing. Truy vết ID 2 trên [1,2,3]: left = 1, mid = 2, right = 3; khóa giữa = 2 → tìm thấy. Kiểm tra thêm ID đầu/cuối. Lệnh: julia TH_2026_10_09_Kiem_thu.jl --phase=search. Thực tế: đạt 5/5 phép kiểm tra.</w:t>
+        <w:t>Truy vết trên danh mục MINI001 [1,2,3] được trình bày dưới đây. Tra ID 2 trả Order(2,4,1,8); tra ID 99 kết thúc với nothing. Pha search đã đạt 5/5 phép kiểm tra.</w:t>
       </w:r>
     </w:p>
+    <w:tbl>
+      <w:tblPr>
+        <w:tblW w:type="auto" w:w="0"/>
+        <w:tblLayout w:type="fixed"/>
+        <w:tblLook w:firstColumn="1" w:firstRow="1" w:lastColumn="0" w:lastRow="0" w:noHBand="0" w:noVBand="1" w:val="04A0"/>
+      </w:tblPr>
+      <w:tblGrid>
+        <w:gridCol w:w="1008"/>
+        <w:gridCol w:w="1584"/>
+        <w:gridCol w:w="1872"/>
+        <w:gridCol w:w="4176"/>
+      </w:tblGrid>
+      <w:tr>
+        <w:tc>
+          <w:tcPr>
+            <w:tcW w:type="dxa" w:w="1008"/>
+            <w:vAlign w:val="center"/>
+            <w:tcBorders>
+              <w:top w:val="single" w:sz="4" w:color="D9D9D9"/>
+              <w:left w:val="single" w:sz="4" w:color="D9D9D9"/>
+              <w:bottom w:val="single" w:sz="4" w:color="D9D9D9"/>
+              <w:right w:val="single" w:sz="4" w:color="D9D9D9"/>
+            </w:tcBorders>
+            <w:shd w:fill="DCE6F1"/>
+          </w:tcPr>
+          <w:p>
+            <w:pPr>
+              <w:spacing w:after="80" w:before="80" w:line="240" w:lineRule="auto"/>
+            </w:pPr>
+            <w:r>
+              <w:rPr>
+                <w:b/>
+                <w:sz w:val="22"/>
+              </w:rPr>
+              <w:t>Khóa</w:t>
+            </w:r>
+          </w:p>
+        </w:tc>
+        <w:tc>
+          <w:tcPr>
+            <w:tcW w:type="dxa" w:w="1584"/>
+            <w:vAlign w:val="center"/>
+            <w:tcBorders>
+              <w:top w:val="single" w:sz="4" w:color="D9D9D9"/>
+              <w:left w:val="single" w:sz="4" w:color="D9D9D9"/>
+              <w:bottom w:val="single" w:sz="4" w:color="D9D9D9"/>
+              <w:right w:val="single" w:sz="4" w:color="D9D9D9"/>
+            </w:tcBorders>
+            <w:shd w:fill="DCE6F1"/>
+          </w:tcPr>
+          <w:p>
+            <w:pPr>
+              <w:spacing w:after="80" w:before="80" w:line="240" w:lineRule="auto"/>
+            </w:pPr>
+            <w:r>
+              <w:rPr>
+                <w:b/>
+                <w:sz w:val="22"/>
+              </w:rPr>
+              <w:t>left, right</w:t>
+            </w:r>
+          </w:p>
+        </w:tc>
+        <w:tc>
+          <w:tcPr>
+            <w:tcW w:type="dxa" w:w="1872"/>
+            <w:vAlign w:val="center"/>
+            <w:tcBorders>
+              <w:top w:val="single" w:sz="4" w:color="D9D9D9"/>
+              <w:left w:val="single" w:sz="4" w:color="D9D9D9"/>
+              <w:bottom w:val="single" w:sz="4" w:color="D9D9D9"/>
+              <w:right w:val="single" w:sz="4" w:color="D9D9D9"/>
+            </w:tcBorders>
+            <w:shd w:fill="DCE6F1"/>
+          </w:tcPr>
+          <w:p>
+            <w:pPr>
+              <w:spacing w:after="80" w:before="80" w:line="240" w:lineRule="auto"/>
+            </w:pPr>
+            <w:r>
+              <w:rPr>
+                <w:b/>
+                <w:sz w:val="22"/>
+              </w:rPr>
+              <w:t>mid / ID giữa</w:t>
+            </w:r>
+          </w:p>
+        </w:tc>
+        <w:tc>
+          <w:tcPr>
+            <w:tcW w:type="dxa" w:w="4176"/>
+            <w:vAlign w:val="center"/>
+            <w:tcBorders>
+              <w:top w:val="single" w:sz="4" w:color="D9D9D9"/>
+              <w:left w:val="single" w:sz="4" w:color="D9D9D9"/>
+              <w:bottom w:val="single" w:sz="4" w:color="D9D9D9"/>
+              <w:right w:val="single" w:sz="4" w:color="D9D9D9"/>
+            </w:tcBorders>
+            <w:shd w:fill="DCE6F1"/>
+          </w:tcPr>
+          <w:p>
+            <w:pPr>
+              <w:spacing w:after="80" w:before="80" w:line="240" w:lineRule="auto"/>
+            </w:pPr>
+            <w:r>
+              <w:rPr>
+                <w:b/>
+                <w:sz w:val="22"/>
+              </w:rPr>
+              <w:t>Quyết định</w:t>
+            </w:r>
+          </w:p>
+        </w:tc>
+      </w:tr>
+      <w:tr>
+        <w:tc>
+          <w:tcPr>
+            <w:tcW w:type="dxa" w:w="1008"/>
+            <w:vAlign w:val="center"/>
+            <w:tcBorders>
+              <w:top w:val="single" w:sz="4" w:color="D9D9D9"/>
+              <w:left w:val="single" w:sz="4" w:color="D9D9D9"/>
+              <w:bottom w:val="single" w:sz="4" w:color="D9D9D9"/>
+              <w:right w:val="single" w:sz="4" w:color="D9D9D9"/>
+            </w:tcBorders>
+          </w:tcPr>
+          <w:p>
+            <w:pPr>
+              <w:spacing w:after="80" w:before="80" w:line="240" w:lineRule="auto"/>
+            </w:pPr>
+            <w:r>
+              <w:rPr>
+                <w:b w:val="0"/>
+                <w:sz w:val="22"/>
+              </w:rPr>
+              <w:t>2</w:t>
+            </w:r>
+          </w:p>
+        </w:tc>
+        <w:tc>
+          <w:tcPr>
+            <w:tcW w:type="dxa" w:w="1584"/>
+            <w:vAlign w:val="center"/>
+            <w:tcBorders>
+              <w:top w:val="single" w:sz="4" w:color="D9D9D9"/>
+              <w:left w:val="single" w:sz="4" w:color="D9D9D9"/>
+              <w:bottom w:val="single" w:sz="4" w:color="D9D9D9"/>
+              <w:right w:val="single" w:sz="4" w:color="D9D9D9"/>
+            </w:tcBorders>
+          </w:tcPr>
+          <w:p>
+            <w:pPr>
+              <w:spacing w:after="80" w:before="80" w:line="240" w:lineRule="auto"/>
+            </w:pPr>
+            <w:r>
+              <w:rPr>
+                <w:b w:val="0"/>
+                <w:sz w:val="22"/>
+              </w:rPr>
+              <w:t>1, 3</w:t>
+            </w:r>
+          </w:p>
+        </w:tc>
+        <w:tc>
+          <w:tcPr>
+            <w:tcW w:type="dxa" w:w="1872"/>
+            <w:vAlign w:val="center"/>
+            <w:tcBorders>
+              <w:top w:val="single" w:sz="4" w:color="D9D9D9"/>
+              <w:left w:val="single" w:sz="4" w:color="D9D9D9"/>
+              <w:bottom w:val="single" w:sz="4" w:color="D9D9D9"/>
+              <w:right w:val="single" w:sz="4" w:color="D9D9D9"/>
+            </w:tcBorders>
+          </w:tcPr>
+          <w:p>
+            <w:pPr>
+              <w:spacing w:after="80" w:before="80" w:line="240" w:lineRule="auto"/>
+            </w:pPr>
+            <w:r>
+              <w:rPr>
+                <w:b w:val="0"/>
+                <w:sz w:val="22"/>
+              </w:rPr>
+              <w:t>2 / 2</w:t>
+            </w:r>
+          </w:p>
+        </w:tc>
+        <w:tc>
+          <w:tcPr>
+            <w:tcW w:type="dxa" w:w="4176"/>
+            <w:vAlign w:val="center"/>
+            <w:tcBorders>
+              <w:top w:val="single" w:sz="4" w:color="D9D9D9"/>
+              <w:left w:val="single" w:sz="4" w:color="D9D9D9"/>
+              <w:bottom w:val="single" w:sz="4" w:color="D9D9D9"/>
+              <w:right w:val="single" w:sz="4" w:color="D9D9D9"/>
+            </w:tcBorders>
+          </w:tcPr>
+          <w:p>
+            <w:pPr>
+              <w:spacing w:after="80" w:before="80" w:line="240" w:lineRule="auto"/>
+            </w:pPr>
+            <w:r>
+              <w:rPr>
+                <w:b w:val="0"/>
+                <w:sz w:val="22"/>
+              </w:rPr>
+              <w:t>Trả Order ID 2</w:t>
+            </w:r>
+          </w:p>
+        </w:tc>
+      </w:tr>
+      <w:tr>
+        <w:tc>
+          <w:tcPr>
+            <w:tcW w:type="dxa" w:w="1008"/>
+            <w:vAlign w:val="center"/>
+            <w:tcBorders>
+              <w:top w:val="single" w:sz="4" w:color="D9D9D9"/>
+              <w:left w:val="single" w:sz="4" w:color="D9D9D9"/>
+              <w:bottom w:val="single" w:sz="4" w:color="D9D9D9"/>
+              <w:right w:val="single" w:sz="4" w:color="D9D9D9"/>
+            </w:tcBorders>
+          </w:tcPr>
+          <w:p>
+            <w:pPr>
+              <w:spacing w:after="80" w:before="80" w:line="240" w:lineRule="auto"/>
+            </w:pPr>
+            <w:r>
+              <w:rPr>
+                <w:b w:val="0"/>
+                <w:sz w:val="22"/>
+              </w:rPr>
+              <w:t>99</w:t>
+            </w:r>
+          </w:p>
+        </w:tc>
+        <w:tc>
+          <w:tcPr>
+            <w:tcW w:type="dxa" w:w="1584"/>
+            <w:vAlign w:val="center"/>
+            <w:tcBorders>
+              <w:top w:val="single" w:sz="4" w:color="D9D9D9"/>
+              <w:left w:val="single" w:sz="4" w:color="D9D9D9"/>
+              <w:bottom w:val="single" w:sz="4" w:color="D9D9D9"/>
+              <w:right w:val="single" w:sz="4" w:color="D9D9D9"/>
+            </w:tcBorders>
+          </w:tcPr>
+          <w:p>
+            <w:pPr>
+              <w:spacing w:after="80" w:before="80" w:line="240" w:lineRule="auto"/>
+            </w:pPr>
+            <w:r>
+              <w:rPr>
+                <w:b w:val="0"/>
+                <w:sz w:val="22"/>
+              </w:rPr>
+              <w:t>1, 3</w:t>
+            </w:r>
+          </w:p>
+        </w:tc>
+        <w:tc>
+          <w:tcPr>
+            <w:tcW w:type="dxa" w:w="1872"/>
+            <w:vAlign w:val="center"/>
+            <w:tcBorders>
+              <w:top w:val="single" w:sz="4" w:color="D9D9D9"/>
+              <w:left w:val="single" w:sz="4" w:color="D9D9D9"/>
+              <w:bottom w:val="single" w:sz="4" w:color="D9D9D9"/>
+              <w:right w:val="single" w:sz="4" w:color="D9D9D9"/>
+            </w:tcBorders>
+          </w:tcPr>
+          <w:p>
+            <w:pPr>
+              <w:spacing w:after="80" w:before="80" w:line="240" w:lineRule="auto"/>
+            </w:pPr>
+            <w:r>
+              <w:rPr>
+                <w:b w:val="0"/>
+                <w:sz w:val="22"/>
+              </w:rPr>
+              <w:t>2 / 2</w:t>
+            </w:r>
+          </w:p>
+        </w:tc>
+        <w:tc>
+          <w:tcPr>
+            <w:tcW w:type="dxa" w:w="4176"/>
+            <w:vAlign w:val="center"/>
+            <w:tcBorders>
+              <w:top w:val="single" w:sz="4" w:color="D9D9D9"/>
+              <w:left w:val="single" w:sz="4" w:color="D9D9D9"/>
+              <w:bottom w:val="single" w:sz="4" w:color="D9D9D9"/>
+              <w:right w:val="single" w:sz="4" w:color="D9D9D9"/>
+            </w:tcBorders>
+          </w:tcPr>
+          <w:p>
+            <w:pPr>
+              <w:spacing w:after="80" w:before="80" w:line="240" w:lineRule="auto"/>
+            </w:pPr>
+            <w:r>
+              <w:rPr>
+                <w:b w:val="0"/>
+                <w:sz w:val="22"/>
+              </w:rPr>
+              <w:t>99 &gt; 2 → left = 3</w:t>
+            </w:r>
+          </w:p>
+        </w:tc>
+      </w:tr>
+      <w:tr>
+        <w:tc>
+          <w:tcPr>
+            <w:tcW w:type="dxa" w:w="1008"/>
+            <w:vAlign w:val="center"/>
+            <w:tcBorders>
+              <w:top w:val="single" w:sz="4" w:color="D9D9D9"/>
+              <w:left w:val="single" w:sz="4" w:color="D9D9D9"/>
+              <w:bottom w:val="single" w:sz="4" w:color="D9D9D9"/>
+              <w:right w:val="single" w:sz="4" w:color="D9D9D9"/>
+            </w:tcBorders>
+          </w:tcPr>
+          <w:p>
+            <w:pPr>
+              <w:spacing w:after="80" w:before="80" w:line="240" w:lineRule="auto"/>
+            </w:pPr>
+            <w:r>
+              <w:rPr>
+                <w:b w:val="0"/>
+                <w:sz w:val="22"/>
+              </w:rPr>
+              <w:t>99</w:t>
+            </w:r>
+          </w:p>
+        </w:tc>
+        <w:tc>
+          <w:tcPr>
+            <w:tcW w:type="dxa" w:w="1584"/>
+            <w:vAlign w:val="center"/>
+            <w:tcBorders>
+              <w:top w:val="single" w:sz="4" w:color="D9D9D9"/>
+              <w:left w:val="single" w:sz="4" w:color="D9D9D9"/>
+              <w:bottom w:val="single" w:sz="4" w:color="D9D9D9"/>
+              <w:right w:val="single" w:sz="4" w:color="D9D9D9"/>
+            </w:tcBorders>
+          </w:tcPr>
+          <w:p>
+            <w:pPr>
+              <w:spacing w:after="80" w:before="80" w:line="240" w:lineRule="auto"/>
+            </w:pPr>
+            <w:r>
+              <w:rPr>
+                <w:b w:val="0"/>
+                <w:sz w:val="22"/>
+              </w:rPr>
+              <w:t>3, 3</w:t>
+            </w:r>
+          </w:p>
+        </w:tc>
+        <w:tc>
+          <w:tcPr>
+            <w:tcW w:type="dxa" w:w="1872"/>
+            <w:vAlign w:val="center"/>
+            <w:tcBorders>
+              <w:top w:val="single" w:sz="4" w:color="D9D9D9"/>
+              <w:left w:val="single" w:sz="4" w:color="D9D9D9"/>
+              <w:bottom w:val="single" w:sz="4" w:color="D9D9D9"/>
+              <w:right w:val="single" w:sz="4" w:color="D9D9D9"/>
+            </w:tcBorders>
+          </w:tcPr>
+          <w:p>
+            <w:pPr>
+              <w:spacing w:after="80" w:before="80" w:line="240" w:lineRule="auto"/>
+            </w:pPr>
+            <w:r>
+              <w:rPr>
+                <w:b w:val="0"/>
+                <w:sz w:val="22"/>
+              </w:rPr>
+              <w:t>3 / 3</w:t>
+            </w:r>
+          </w:p>
+        </w:tc>
+        <w:tc>
+          <w:tcPr>
+            <w:tcW w:type="dxa" w:w="4176"/>
+            <w:vAlign w:val="center"/>
+            <w:tcBorders>
+              <w:top w:val="single" w:sz="4" w:color="D9D9D9"/>
+              <w:left w:val="single" w:sz="4" w:color="D9D9D9"/>
+              <w:bottom w:val="single" w:sz="4" w:color="D9D9D9"/>
+              <w:right w:val="single" w:sz="4" w:color="D9D9D9"/>
+            </w:tcBorders>
+          </w:tcPr>
+          <w:p>
+            <w:pPr>
+              <w:spacing w:after="80" w:before="80" w:line="240" w:lineRule="auto"/>
+            </w:pPr>
+            <w:r>
+              <w:rPr>
+                <w:b w:val="0"/>
+                <w:sz w:val="22"/>
+              </w:rPr>
+              <w:t>99 &gt; 3 → left = 4</w:t>
+            </w:r>
+          </w:p>
+        </w:tc>
+      </w:tr>
+      <w:tr>
+        <w:tc>
+          <w:tcPr>
+            <w:tcW w:type="dxa" w:w="1008"/>
+            <w:vAlign w:val="center"/>
+            <w:tcBorders>
+              <w:top w:val="single" w:sz="4" w:color="D9D9D9"/>
+              <w:left w:val="single" w:sz="4" w:color="D9D9D9"/>
+              <w:bottom w:val="single" w:sz="4" w:color="D9D9D9"/>
+              <w:right w:val="single" w:sz="4" w:color="D9D9D9"/>
+            </w:tcBorders>
+          </w:tcPr>
+          <w:p>
+            <w:pPr>
+              <w:spacing w:after="80" w:before="80" w:line="240" w:lineRule="auto"/>
+            </w:pPr>
+            <w:r>
+              <w:rPr>
+                <w:b w:val="0"/>
+                <w:sz w:val="22"/>
+              </w:rPr>
+              <w:t>99</w:t>
+            </w:r>
+          </w:p>
+        </w:tc>
+        <w:tc>
+          <w:tcPr>
+            <w:tcW w:type="dxa" w:w="1584"/>
+            <w:vAlign w:val="center"/>
+            <w:tcBorders>
+              <w:top w:val="single" w:sz="4" w:color="D9D9D9"/>
+              <w:left w:val="single" w:sz="4" w:color="D9D9D9"/>
+              <w:bottom w:val="single" w:sz="4" w:color="D9D9D9"/>
+              <w:right w:val="single" w:sz="4" w:color="D9D9D9"/>
+            </w:tcBorders>
+          </w:tcPr>
+          <w:p>
+            <w:pPr>
+              <w:spacing w:after="80" w:before="80" w:line="240" w:lineRule="auto"/>
+            </w:pPr>
+            <w:r>
+              <w:rPr>
+                <w:b w:val="0"/>
+                <w:sz w:val="22"/>
+              </w:rPr>
+              <w:t>4, 3</w:t>
+            </w:r>
+          </w:p>
+        </w:tc>
+        <w:tc>
+          <w:tcPr>
+            <w:tcW w:type="dxa" w:w="1872"/>
+            <w:vAlign w:val="center"/>
+            <w:tcBorders>
+              <w:top w:val="single" w:sz="4" w:color="D9D9D9"/>
+              <w:left w:val="single" w:sz="4" w:color="D9D9D9"/>
+              <w:bottom w:val="single" w:sz="4" w:color="D9D9D9"/>
+              <w:right w:val="single" w:sz="4" w:color="D9D9D9"/>
+            </w:tcBorders>
+          </w:tcPr>
+          <w:p>
+            <w:pPr>
+              <w:spacing w:after="80" w:before="80" w:line="240" w:lineRule="auto"/>
+            </w:pPr>
+            <w:r>
+              <w:rPr>
+                <w:b w:val="0"/>
+                <w:sz w:val="22"/>
+              </w:rPr>
+              <w:t>Không xét</w:t>
+            </w:r>
+          </w:p>
+        </w:tc>
+        <w:tc>
+          <w:tcPr>
+            <w:tcW w:type="dxa" w:w="4176"/>
+            <w:vAlign w:val="center"/>
+            <w:tcBorders>
+              <w:top w:val="single" w:sz="4" w:color="D9D9D9"/>
+              <w:left w:val="single" w:sz="4" w:color="D9D9D9"/>
+              <w:bottom w:val="single" w:sz="4" w:color="D9D9D9"/>
+              <w:right w:val="single" w:sz="4" w:color="D9D9D9"/>
+            </w:tcBorders>
+          </w:tcPr>
+          <w:p>
+            <w:pPr>
+              <w:spacing w:after="80" w:before="80" w:line="240" w:lineRule="auto"/>
+            </w:pPr>
+            <w:r>
+              <w:rPr>
+                <w:b w:val="0"/>
+                <w:sz w:val="22"/>
+              </w:rPr>
+              <w:t>left &gt; right → nothing</w:t>
+            </w:r>
+          </w:p>
+        </w:tc>
+      </w:tr>
+    </w:tbl>
     <w:p>
       <w:pPr>
         <w:keepLines/>
+        <w:spacing w:after="120" w:line="252" w:lineRule="auto"/>
       </w:pPr>
       <w:r>
-        <w:t>Chi phí thời gian/bộ nhớ: O(log n) thời gian, O(1) bộ nhớ phụ với vòng lặp. Sắp danh mục ban đầu tốn O(n log n), không cần sắp lại sau mỗi lần tìm nếu dữ liệu không đổi.</w:t>
+        <w:t>Phân tích: Sau mỗi vòng, vùng tìm giảm khoảng một nửa nên thời gian O(log n). Hiện thực lặp chỉ giữ các chỉ số và khóa giữa, cần O(1) bộ nhớ phụ. Chi phí sắp danh mục O(n log n) được thực hiện trước, không cộng lại cho từng lần tra cứu.</w:t>
       </w:r>
     </w:p>
     <w:p>
@@ -338,6 +868,7 @@
         <w:pStyle w:val="Heading3"/>
         <w:keepNext/>
         <w:keepLines/>
+        <w:spacing w:after="120" w:line="252" w:lineRule="auto"/>
       </w:pPr>
       <w:r>
         <w:t>NV3 · Hoàn thiện bfs_routes(graph, source=1)</w:t>
@@ -346,26 +877,29 @@
     <w:p>
       <w:pPr>
         <w:keepLines/>
+        <w:spacing w:after="120" w:line="252" w:lineRule="auto"/>
       </w:pPr>
       <w:r>
-        <w:t>Ý tưởng/điều kiện áp dụng: Đồ thị vô hướng không trọng số, mỗi cạnh mất một đơn vị thời gian. Dùng CircularQueue; đặt distance = −1, nguồn có distance = 0 và parent = 0. Khi phát hiện v từ u, ghi distance[v] = distance[u] + 1 và parent[v] = u trước khi đưa v vào FIFO. Lần ngược parent rồi đảo để dựng tuyến; đỉnh không tới được giữ −1 và tuyến rỗng. Trả distance, parent, routes.</w:t>
+        <w:t>Cách thực hiện: BFS bắt đầu tại kho 1, dùng CircularQueue để xét các đỉnh theo lớp khoảng cách. Ban đầu distance của mọi đỉnh là −1; nguồn có distance = 0, parent = 0 và được đưa vào hàng đợi. Khi từ u gặp v chưa thăm, ghi distance[v] = distance[u] + 1, parent[v] = u rồi mới enqueue(v); nhờ đó mỗi đỉnh chỉ vào hàng đợi một lần. Khi hàng đợi rỗng, lần ngược parent và đảo dãy để dựng routes. Đỉnh không tới được giữ khoảng cách −1 và tuyến rỗng. BFS áp dụng cho bản đồ không trọng số, nơi mỗi cạnh có cùng chi phí.</w:t>
       </w:r>
     </w:p>
     <w:p>
       <w:pPr>
         <w:keepNext/>
         <w:keepLines/>
+        <w:spacing w:after="120" w:line="252" w:lineRule="auto"/>
       </w:pPr>
       <w:r>
-        <w:t>Lời gọi và kết quả kiểm thử: bfs_routes(graph,1) kỳ vọng distance = [0,1,1,2,2,3]. FIFO lần lượt: [1] → [2,3] → [3,4] → [4,5] → [5,6] → [6] → []. Tính costs[o.id] = 2 × distance[o.destination] + o.service. Kiểm tra thêm nguồn 4 và đỉnh cô lập; chấp nhận các tuyến ngắn nhất khác nhau. Lệnh: julia TH_2026_10_09_Kiem_thu.jl --phase=bfs. Thực tế: đạt 7/7 phép kiểm tra.</w:t>
+        <w:t>Truy vết MINI001: các lớp BFS là {1} → {2,3} → {4,5} → {6}, cho distance = [0,1,1,2,2,3]. Một tuyến đến 6 là 1→2→4→6. Ba đơn có chi phí 3,5,7 theo bảng ở mục 2; costs này được truyền trực tiếp vào DP. Thứ tự duyệt láng giềng có thể làm đổi parent nhưng không đổi độ dài ngắn nhất. Pha bfs đạt 7/7 phép kiểm tra.</w:t>
       </w:r>
     </w:p>
     <w:p>
       <w:pPr>
         <w:keepLines/>
+        <w:spacing w:after="120" w:line="252" w:lineRule="auto"/>
       </w:pPr>
       <w:r>
-        <w:t>Chi phí thời gian/bộ nhớ: BFS cốt lõi O(V + E) thời gian, O(V) bộ nhớ phụ ngoài đồ thị. Nếu dựng/lưu mọi routes, cộng O(L) thời gian và bộ nhớ, với L là tổng số đỉnh trên các tuyến; L có thể O(V²). Tính chi phí n đơn thêm O(n).</w:t>
+        <w:t>Phân tích: Duyệt BFS tốn O(V + E) thời gian và O(V) bộ nhớ phụ ngoài đồ thị. Việc dựng và giữ toàn bộ routes cần thêm O(L) thời gian, bộ nhớ, với L là tổng độ dài các tuyến; trường hợp xấu L = O(V²). Sau BFS, tính chi phí cho n đơn mất O(n).</w:t>
       </w:r>
     </w:p>
     <w:p>
@@ -373,6 +907,7 @@
         <w:pStyle w:val="Heading3"/>
         <w:keepNext/>
         <w:keepLines/>
+        <w:spacing w:after="120" w:line="252" w:lineRule="auto"/>
       </w:pPr>
       <w:r>
         <w:t>NV4 · Hoàn thiện knapsack(orders, costs, budget)</w:t>
@@ -381,26 +916,31 @@
     <w:p>
       <w:pPr>
         <w:keepLines/>
+        <w:spacing w:after="120" w:line="252" w:lineRule="auto"/>
       </w:pPr>
       <w:r>
-        <w:t>Ý tưởng/điều kiện áp dụng: Ngân sách B nguyên không âm; chi phí tra theo ID từ BFS. F(i,b) là lợi ích tốt nhất khi xét i đơn đầu với ngân sách b. Nếu τᵢ &gt; b thì giữ F(i−1,b); ngược lại lấy max(F(i−1,b), lợi_íchᵢ + F(i−1,b−τᵢ)). F(0,b) = F(i,0) = 0 vì chi phí đơn dương. Dùng table[i+1,b+1]; truy vết từ (n,B), giảm i mỗi bước. Khi hòa giữ phương án không lấy. Trả ids, value, cost, table.</w:t>
+        <w:t>Cách thực hiện: Gọi F(i,b) là lợi ích lớn nhất từ i đơn đầu khi còn giới hạn b. Với chi phí τᵢ và lợi ích vᵢ, nếu τᵢ &gt; b thì F(i,b) = F(i−1,b); ngược lại F(i,b) = max(F(i−1,b), vᵢ + F(i−1,b−τᵢ)). Khởi tạo hàng 0 bằng 0; cột ngân sách 0 cũng bằng 0 vì chi phí đơn dương. B phải là số nguyên không âm; chi phí được tra theo ID.</w:t>
+        <w:br/>
+        <w:t>Trong Julia, F(i,b) nằm tại table[i+1,b+1]. Truy vết từ (n,B): ô hiện tại lớn hơn ô cùng ngân sách ở hàng trước thì chọn đơn, trừ chi phí; mỗi bước đều giảm i. Nếu hòa thì bỏ đơn. Hàm trả ids, value, cost và table, bảo đảm một đơn không bị chọn nhiều lần.</w:t>
       </w:r>
     </w:p>
     <w:p>
       <w:pPr>
         <w:keepNext/>
         <w:keepLines/>
+        <w:spacing w:after="120" w:line="252" w:lineRule="auto"/>
       </w:pPr>
       <w:r>
-        <w:t>Lời gọi và kết quả kiểm thử: knapsack(orders,costs,8) kỳ vọng ids có tập {1,2}, value = 14, cost = 8, bảng 4 × 9. Kiểm tra B = 0, dãy rỗng, ngân sách âm phải báo lỗi, không lặp ID và giá trị bằng vét cạn. Lệnh: julia TH_2026_10_09_Kiem_thu.jl --phase=dp. Thực tế: đạt 12/12 phép kiểm tra.</w:t>
+        <w:t>Kiểm chứng: MINI001 tạo bảng 4 × 9, chọn tập {1,2}, cost = 8 và value = 14. Các trường hợp B = 0, không có đơn, ngân sách âm và so sánh với vét cạn đều thuộc phần kiểm tra DP. Kết quả pha dp: đạt 12/12.</w:t>
       </w:r>
     </w:p>
     <w:p>
       <w:pPr>
         <w:keepLines/>
+        <w:spacing w:after="120" w:line="252" w:lineRule="auto"/>
       </w:pPr>
       <w:r>
-        <w:t>Chi phí thời gian/bộ nhớ: Bảng đầy đủ O(nB) thời gian và O(nB) bộ nhớ; truy vết O(n). Đây là độ phức tạp theo giá trị B. Vét cạn tính tổng từng tập cần O(n × 2ⁿ), chỉ phù hợp bộ nhỏ.</w:t>
+        <w:t>Phân tích: Có (n+1)(B+1) ô, mỗi ô xử lý O(1), nên thời gian và bộ nhớ bảng là O(nB); truy vết O(n). Đây là chi phí phụ thuộc giá trị ngân sách B. Vét cạn cộng trực tiếp từng tập con tốn O(n × 2ⁿ), chỉ thích hợp để đối chiếu các bộ nhỏ.</w:t>
       </w:r>
     </w:p>
     <w:p>
@@ -408,6 +948,7 @@
         <w:pStyle w:val="Heading2"/>
         <w:keepNext/>
         <w:keepLines/>
+        <w:spacing w:after="120" w:line="252" w:lineRule="auto"/>
       </w:pPr>
       <w:r>
         <w:t>4. Quyết định chọn đơn</w:t>
@@ -417,6 +958,7 @@
       <w:pPr>
         <w:keepNext/>
         <w:keepLines/>
+        <w:spacing w:after="120" w:line="252" w:lineRule="auto"/>
       </w:pPr>
       <w:r>
         <w:t>Điền ngân sách, tập chọn, tổng thời gian/lợi ích. Giải thích một ô DP và một bước truy vết; đối chiếu với vét cạn.</w:t>
@@ -425,13 +967,14 @@
     <w:p>
       <w:pPr>
         <w:keepLines/>
+        <w:spacing w:after="120" w:line="252" w:lineRule="auto"/>
       </w:pPr>
       <w:r>
-        <w:t>Tính tay: B = 8; chọn ID {1,2}; tổng thời gian 3 + 5 = 8, lợi ích 6 + 8 = 14. F(2,8) = max(F(1,8), 8 + F(1,3)) = max(6,14) = 14, nằm tại table[3,9]. F(3,8) = max(14, 10 + F(2,1)) = 14.</w:t>
+        <w:t>Với ngân sách 8, hai đơn 1 và 2 sử dụng 3 + 5 = 8 đơn vị thời gian, nhận 6 + 8 = 14 lợi ích. Tại F(2,8), phương án bỏ đơn 2 giữ F(1,8) = 6; phương án lấy đơn 2 nhận 8 + F(1,3) = 14. Vì vậy table[3,9] = 14. Xét thêm đơn 3 chỉ cho 10 + F(2,1) = 10, nên nghiệm vẫn là {1,2}.</w:t>
         <w:br/>
-        <w:t>Truy vết: tại (3,8) bỏ ID 3; tại (2,8) lấy ID 2, còn b = 3; tại (1,3) lấy ID 1, còn b = 0.</w:t>
+        <w:t>Lần ngược bảng: F(3,8) bằng F(2,8) nên bỏ ID 3; F(2,8) lớn hơn F(1,8) nên lấy ID 2 và giảm ngân sách còn 3; tiếp tục lấy ID 1 rồi kết thúc.</w:t>
         <w:br/>
-        <w:t>Đối chiếu tính tay 8 tập con (chi phí; lợi ích): ∅ (0;0), {1} (3;6), {2} (5;8), {3} (7;10), {1,2} (8;14), {1,3} (10;16), {2,3} (12;18), {1,2,3} (15;24). Ba tập cuối vượt B; {1,2} tối ưu trong các tập hợp lệ. Chạy --mini cho kết quả DP = 14 và vét cạn = 14; tập chọn [1,2], tổng chi phí 8.</w:t>
+        <w:t>Đối chiếu tám tập con: các tập hợp lệ ∅, {1}, {2}, {3}, {1,2} có lợi ích lần lượt 0,6,8,10,14. Ba tập {1,3}, {2,3}, {1,2,3} có chi phí 10,12,15, đều vượt 8. Kết quả --mini ghi DP = 14 và vét cạn = 14, phù hợp phép tính tay.</w:t>
       </w:r>
     </w:p>
     <w:p>
@@ -439,6 +982,7 @@
         <w:pStyle w:val="Heading2"/>
         <w:keepNext/>
         <w:keepLines/>
+        <w:spacing w:after="120" w:line="252" w:lineRule="auto"/>
       </w:pPr>
       <w:r>
         <w:t>5. Giao và hoàn tác</w:t>
@@ -734,6 +1278,7 @@
         <w:pStyle w:val="Heading2"/>
         <w:keepNext/>
         <w:keepLines/>
+        <w:spacing w:after="120" w:line="252" w:lineRule="auto"/>
       </w:pPr>
       <w:r>
         <w:t>6. Đầu ra và nhận xét</w:t>
@@ -742,38 +1287,843 @@
     <w:p>
       <w:pPr>
         <w:keepLines/>
+        <w:spacing w:after="120" w:line="252" w:lineRule="auto"/>
       </w:pPr>
       <w:r>
-        <w:t>CSV đã xuất: data/MINI001/ket_qua.csv và data/N24DCDT040/ket_qua.csv. MINI001 chọn/giao ID 1,2; ID 3 không chọn.</w:t>
+        <w:t>Kết quả mẫu được xuất tại data/MINI001/ket_qua.csv. Theo dõi ID 2 qua toàn bộ luồng: đọc Order(2,4,1,8) → tra thấy trong danh mục ID → BFS đến đỉnh 4 qua 2 cạnh → costs[2] = 5 → DP chọn → giao xong → CSV ghi duoc_chon = 1, da_giao = 1, trang_thai = da_giao. ID 3 vẫn có trong CSV với trạng thái không chọn.</w:t>
         <w:br/>
-        <w:t>Notebook TH_2026_10_09_Pluto.jl dùng cùng mã lõi; đặt READ_DATA = true, RUN_APP = true rồi chạy bằng Julia. Kết quả mini: lợi ích 14; các trạng thái giao và hoàn tác được ghi trong trace, bất biến đúng. Mã nguồn và minh chứng nằm trong kho GitHub ở đầu phiếu.</w:t>
-        <w:br/>
-        <w:t>Dữ liệu cá nhân N24DCDT040: 8 đơn, ngân sách 28; chọn và giao theo thứ tự [1,6,5,2], tổng chi phí 24, tổng lợi ích 42, hàng chờ rỗng sau giao hết.</w:t>
+        <w:t>Bộ N24DCDT040 có 8 đơn, B = 28. Kế hoạch giao [1,6,5,2] dùng 24 thời gian, thu 42 lợi ích; sau giao hết, FIFO rỗng. Ví dụ đơn 6: tuyến 1→3→4 dài 2 cạnh, phục vụ 3 nên τ = 7; lợi ích 13. Khi giao sau đơn 1, hai tổng tăng từ 4/14 lên 11/27. Kết quả nằm tại data/N24DCDT040/ket_qua.csv.</w:t>
       </w:r>
     </w:p>
     <w:p>
       <w:pPr>
         <w:keepLines/>
+        <w:spacing w:after="120" w:line="252" w:lineRule="auto"/>
       </w:pPr>
       <w:r>
-        <w:t>Lỗi đã phát hiện và cách sửa: Khi ghi kết quả kiểm thử qua đường ống PowerShell, chữ tiếng Việt bị sai mã hóa. Đặt [Console]::OutputEncoding và $OutputEncoding về UTF-8, ghi bằng Out-File -Encoding utf8 và đọc bằng Get-Content -Encoding utf8. Sau sửa, minh chứng hiển thị đúng tiếng Việt. Bốn hàm TODO đã được cài đặt và các pha kiểm thử đều đạt.</w:t>
+        <w:t>Vấn đề gặp khi lưu minh chứng: tiếng Việt hiển thị sai sau khi đưa đầu ra Julia qua đường ống PowerShell. Cách xử lý là đặt [Console]::OutputEncoding và $OutputEncoding về UTF-8, ghi bằng Out-File -Encoding utf8 rồi đọc lại bằng Get-Content -Encoding utf8. Sau điều chỉnh, ket_qua_kiem_thu.txt hiển thị đúng các dòng kết quả. Đây là lỗi mã hóa khi ghi/đọc đầu ra; bộ kiểm thử vẫn báo các pha đạt.</w:t>
       </w:r>
     </w:p>
     <w:p>
       <w:pPr>
         <w:keepLines/>
+        <w:spacing w:after="120" w:line="252" w:lineRule="auto"/>
       </w:pPr>
       <w:r>
-        <w:t>Một chức năng thay đổi ảnh hưởng đến chức năng sau như thế nào? Nếu bỏ hai cạnh (2,4), (3,4), đường ngắn nhất tới 4 dài 4 cạnh, nên chi phí ID 2 tăng từ 5 lên 9. Khi B = 8, DP chuyển từ {1,2} sang {3}, lợi ích 10; FIFO và CSV cũng phải đổi. Đây là tình huống đối chiếu trong pha app.</w:t>
+        <w:t>Quan hệ giữa các chức năng: Trong MINI001, nếu bỏ cạnh (2,4) và (3,4), tuyến ngắn nhất đến 4 phải đi 1→3→5→6→4, dài 4 cạnh. Chi phí đơn 2 trở thành 2×4+1 = 9, vượt B = 8. DP vì thế chọn {3} với lợi ích 10; kế hoạch FIFO và CSV phải được tạo lại từ nghiệm mới. Tình huống này kiểm tra việc thay bản đồ thực sự tác động đến lựa chọn đơn.</w:t>
         <w:br/>
-        <w:t>Kết quả thực tế: data 12/12, sort 8/8, search 5/5, bfs 7/7, dp 12/12, app 16/16; --phase=all đạt 60/60 phép kiểm tra. Minh chứng: ket_qua_kiem_thu.txt. Lệnh: julia TH_2026_10_09_Kiem_thu.jl --phase=all.</w:t>
+        <w:t>Bảng dưới tổng hợp kết quả ghi trong ket_qua_kiem_thu.txt. Với mỗi pha, kết quả mong đợi là toàn bộ phép kiểm tra của pha đều đạt. Cú pháp lệnh: julia TH_2026_10_09_Kiem_thu.jl --phase=&lt;pha&gt;.</w:t>
+        <w:br/>
+        <w:t>Chạy lại: tải đúng commit ở đầu phiếu, mở terminal tại thư mục chứa các tệp .jl, chạy --data, kiểm thử --phase=all rồi chạy julia TH_2026_10_09_Sinh_vien.jl --mini. Với dữ liệu riêng: chạy julia TH_2026_10_09_Sinh_vien.jl --data N24DCDT040, sau đó julia TH_2026_10_09_Sinh_vien.jl N24DCDT040 --demo. Notebook TH_2026_10_09_Pluto.jl đã bật READ_DATA/RUN_APP; chạy julia TH_2026_10_09_Pluto.jl để xem dữ liệu và chuỗi giao–hoàn tác bằng cùng mã lõi.</w:t>
       </w:r>
     </w:p>
+    <w:tbl>
+      <w:tblPr>
+        <w:tblW w:type="auto" w:w="0"/>
+        <w:tblLayout w:type="fixed"/>
+        <w:tblLook w:firstColumn="1" w:firstRow="1" w:lastColumn="0" w:lastRow="0" w:noHBand="0" w:noVBand="1" w:val="04A0"/>
+      </w:tblPr>
+      <w:tblGrid>
+        <w:gridCol w:w="2592"/>
+        <w:gridCol w:w="2016"/>
+        <w:gridCol w:w="2016"/>
+        <w:gridCol w:w="2016"/>
+      </w:tblGrid>
+      <w:tr>
+        <w:tc>
+          <w:tcPr>
+            <w:tcW w:type="dxa" w:w="2592"/>
+            <w:vAlign w:val="center"/>
+            <w:tcBorders>
+              <w:top w:val="single" w:sz="4" w:color="D9D9D9"/>
+              <w:left w:val="single" w:sz="4" w:color="D9D9D9"/>
+              <w:bottom w:val="single" w:sz="4" w:color="D9D9D9"/>
+              <w:right w:val="single" w:sz="4" w:color="D9D9D9"/>
+            </w:tcBorders>
+            <w:shd w:fill="DCE6F1"/>
+          </w:tcPr>
+          <w:p>
+            <w:pPr>
+              <w:spacing w:after="80" w:before="80" w:line="240" w:lineRule="auto"/>
+            </w:pPr>
+            <w:r>
+              <w:rPr>
+                <w:b/>
+                <w:sz w:val="22"/>
+              </w:rPr>
+              <w:t>Pha trong lệnh</w:t>
+            </w:r>
+          </w:p>
+        </w:tc>
+        <w:tc>
+          <w:tcPr>
+            <w:tcW w:type="dxa" w:w="2016"/>
+            <w:vAlign w:val="center"/>
+            <w:tcBorders>
+              <w:top w:val="single" w:sz="4" w:color="D9D9D9"/>
+              <w:left w:val="single" w:sz="4" w:color="D9D9D9"/>
+              <w:bottom w:val="single" w:sz="4" w:color="D9D9D9"/>
+              <w:right w:val="single" w:sz="4" w:color="D9D9D9"/>
+            </w:tcBorders>
+            <w:shd w:fill="DCE6F1"/>
+          </w:tcPr>
+          <w:p>
+            <w:pPr>
+              <w:spacing w:after="80" w:before="80" w:line="240" w:lineRule="auto"/>
+            </w:pPr>
+            <w:r>
+              <w:rPr>
+                <w:b/>
+                <w:sz w:val="22"/>
+              </w:rPr>
+              <w:t>Mong đợi</w:t>
+            </w:r>
+          </w:p>
+        </w:tc>
+        <w:tc>
+          <w:tcPr>
+            <w:tcW w:type="dxa" w:w="2016"/>
+            <w:vAlign w:val="center"/>
+            <w:tcBorders>
+              <w:top w:val="single" w:sz="4" w:color="D9D9D9"/>
+              <w:left w:val="single" w:sz="4" w:color="D9D9D9"/>
+              <w:bottom w:val="single" w:sz="4" w:color="D9D9D9"/>
+              <w:right w:val="single" w:sz="4" w:color="D9D9D9"/>
+            </w:tcBorders>
+            <w:shd w:fill="DCE6F1"/>
+          </w:tcPr>
+          <w:p>
+            <w:pPr>
+              <w:spacing w:after="80" w:before="80" w:line="240" w:lineRule="auto"/>
+            </w:pPr>
+            <w:r>
+              <w:rPr>
+                <w:b/>
+                <w:sz w:val="22"/>
+              </w:rPr>
+              <w:t>Thực tế</w:t>
+            </w:r>
+          </w:p>
+        </w:tc>
+        <w:tc>
+          <w:tcPr>
+            <w:tcW w:type="dxa" w:w="2016"/>
+            <w:vAlign w:val="center"/>
+            <w:tcBorders>
+              <w:top w:val="single" w:sz="4" w:color="D9D9D9"/>
+              <w:left w:val="single" w:sz="4" w:color="D9D9D9"/>
+              <w:bottom w:val="single" w:sz="4" w:color="D9D9D9"/>
+              <w:right w:val="single" w:sz="4" w:color="D9D9D9"/>
+            </w:tcBorders>
+            <w:shd w:fill="DCE6F1"/>
+          </w:tcPr>
+          <w:p>
+            <w:pPr>
+              <w:spacing w:after="80" w:before="80" w:line="240" w:lineRule="auto"/>
+            </w:pPr>
+            <w:r>
+              <w:rPr>
+                <w:b/>
+                <w:sz w:val="22"/>
+              </w:rPr>
+              <w:t>Đánh giá</w:t>
+            </w:r>
+          </w:p>
+        </w:tc>
+      </w:tr>
+      <w:tr>
+        <w:tc>
+          <w:tcPr>
+            <w:tcW w:type="dxa" w:w="2592"/>
+            <w:vAlign w:val="center"/>
+            <w:tcBorders>
+              <w:top w:val="single" w:sz="4" w:color="D9D9D9"/>
+              <w:left w:val="single" w:sz="4" w:color="D9D9D9"/>
+              <w:bottom w:val="single" w:sz="4" w:color="D9D9D9"/>
+              <w:right w:val="single" w:sz="4" w:color="D9D9D9"/>
+            </w:tcBorders>
+          </w:tcPr>
+          <w:p>
+            <w:pPr>
+              <w:spacing w:after="80" w:before="80" w:line="240" w:lineRule="auto"/>
+            </w:pPr>
+            <w:r>
+              <w:rPr>
+                <w:b w:val="0"/>
+                <w:sz w:val="22"/>
+              </w:rPr>
+              <w:t>data</w:t>
+            </w:r>
+          </w:p>
+        </w:tc>
+        <w:tc>
+          <w:tcPr>
+            <w:tcW w:type="dxa" w:w="2016"/>
+            <w:vAlign w:val="center"/>
+            <w:tcBorders>
+              <w:top w:val="single" w:sz="4" w:color="D9D9D9"/>
+              <w:left w:val="single" w:sz="4" w:color="D9D9D9"/>
+              <w:bottom w:val="single" w:sz="4" w:color="D9D9D9"/>
+              <w:right w:val="single" w:sz="4" w:color="D9D9D9"/>
+            </w:tcBorders>
+          </w:tcPr>
+          <w:p>
+            <w:pPr>
+              <w:spacing w:after="80" w:before="80" w:line="240" w:lineRule="auto"/>
+            </w:pPr>
+            <w:r>
+              <w:rPr>
+                <w:b w:val="0"/>
+                <w:sz w:val="22"/>
+              </w:rPr>
+              <w:t>12/12</w:t>
+            </w:r>
+          </w:p>
+        </w:tc>
+        <w:tc>
+          <w:tcPr>
+            <w:tcW w:type="dxa" w:w="2016"/>
+            <w:vAlign w:val="center"/>
+            <w:tcBorders>
+              <w:top w:val="single" w:sz="4" w:color="D9D9D9"/>
+              <w:left w:val="single" w:sz="4" w:color="D9D9D9"/>
+              <w:bottom w:val="single" w:sz="4" w:color="D9D9D9"/>
+              <w:right w:val="single" w:sz="4" w:color="D9D9D9"/>
+            </w:tcBorders>
+          </w:tcPr>
+          <w:p>
+            <w:pPr>
+              <w:spacing w:after="80" w:before="80" w:line="240" w:lineRule="auto"/>
+            </w:pPr>
+            <w:r>
+              <w:rPr>
+                <w:b w:val="0"/>
+                <w:sz w:val="22"/>
+              </w:rPr>
+              <w:t>12/12</w:t>
+            </w:r>
+          </w:p>
+        </w:tc>
+        <w:tc>
+          <w:tcPr>
+            <w:tcW w:type="dxa" w:w="2016"/>
+            <w:vAlign w:val="center"/>
+            <w:tcBorders>
+              <w:top w:val="single" w:sz="4" w:color="D9D9D9"/>
+              <w:left w:val="single" w:sz="4" w:color="D9D9D9"/>
+              <w:bottom w:val="single" w:sz="4" w:color="D9D9D9"/>
+              <w:right w:val="single" w:sz="4" w:color="D9D9D9"/>
+            </w:tcBorders>
+          </w:tcPr>
+          <w:p>
+            <w:pPr>
+              <w:spacing w:after="80" w:before="80" w:line="240" w:lineRule="auto"/>
+            </w:pPr>
+            <w:r>
+              <w:rPr>
+                <w:b w:val="0"/>
+                <w:sz w:val="22"/>
+              </w:rPr>
+              <w:t>Đạt</w:t>
+            </w:r>
+          </w:p>
+        </w:tc>
+      </w:tr>
+      <w:tr>
+        <w:tc>
+          <w:tcPr>
+            <w:tcW w:type="dxa" w:w="2592"/>
+            <w:vAlign w:val="center"/>
+            <w:tcBorders>
+              <w:top w:val="single" w:sz="4" w:color="D9D9D9"/>
+              <w:left w:val="single" w:sz="4" w:color="D9D9D9"/>
+              <w:bottom w:val="single" w:sz="4" w:color="D9D9D9"/>
+              <w:right w:val="single" w:sz="4" w:color="D9D9D9"/>
+            </w:tcBorders>
+          </w:tcPr>
+          <w:p>
+            <w:pPr>
+              <w:spacing w:after="80" w:before="80" w:line="240" w:lineRule="auto"/>
+            </w:pPr>
+            <w:r>
+              <w:rPr>
+                <w:b w:val="0"/>
+                <w:sz w:val="22"/>
+              </w:rPr>
+              <w:t>sort</w:t>
+            </w:r>
+          </w:p>
+        </w:tc>
+        <w:tc>
+          <w:tcPr>
+            <w:tcW w:type="dxa" w:w="2016"/>
+            <w:vAlign w:val="center"/>
+            <w:tcBorders>
+              <w:top w:val="single" w:sz="4" w:color="D9D9D9"/>
+              <w:left w:val="single" w:sz="4" w:color="D9D9D9"/>
+              <w:bottom w:val="single" w:sz="4" w:color="D9D9D9"/>
+              <w:right w:val="single" w:sz="4" w:color="D9D9D9"/>
+            </w:tcBorders>
+          </w:tcPr>
+          <w:p>
+            <w:pPr>
+              <w:spacing w:after="80" w:before="80" w:line="240" w:lineRule="auto"/>
+            </w:pPr>
+            <w:r>
+              <w:rPr>
+                <w:b w:val="0"/>
+                <w:sz w:val="22"/>
+              </w:rPr>
+              <w:t>8/8</w:t>
+            </w:r>
+          </w:p>
+        </w:tc>
+        <w:tc>
+          <w:tcPr>
+            <w:tcW w:type="dxa" w:w="2016"/>
+            <w:vAlign w:val="center"/>
+            <w:tcBorders>
+              <w:top w:val="single" w:sz="4" w:color="D9D9D9"/>
+              <w:left w:val="single" w:sz="4" w:color="D9D9D9"/>
+              <w:bottom w:val="single" w:sz="4" w:color="D9D9D9"/>
+              <w:right w:val="single" w:sz="4" w:color="D9D9D9"/>
+            </w:tcBorders>
+          </w:tcPr>
+          <w:p>
+            <w:pPr>
+              <w:spacing w:after="80" w:before="80" w:line="240" w:lineRule="auto"/>
+            </w:pPr>
+            <w:r>
+              <w:rPr>
+                <w:b w:val="0"/>
+                <w:sz w:val="22"/>
+              </w:rPr>
+              <w:t>8/8</w:t>
+            </w:r>
+          </w:p>
+        </w:tc>
+        <w:tc>
+          <w:tcPr>
+            <w:tcW w:type="dxa" w:w="2016"/>
+            <w:vAlign w:val="center"/>
+            <w:tcBorders>
+              <w:top w:val="single" w:sz="4" w:color="D9D9D9"/>
+              <w:left w:val="single" w:sz="4" w:color="D9D9D9"/>
+              <w:bottom w:val="single" w:sz="4" w:color="D9D9D9"/>
+              <w:right w:val="single" w:sz="4" w:color="D9D9D9"/>
+            </w:tcBorders>
+          </w:tcPr>
+          <w:p>
+            <w:pPr>
+              <w:spacing w:after="80" w:before="80" w:line="240" w:lineRule="auto"/>
+            </w:pPr>
+            <w:r>
+              <w:rPr>
+                <w:b w:val="0"/>
+                <w:sz w:val="22"/>
+              </w:rPr>
+              <w:t>Đạt</w:t>
+            </w:r>
+          </w:p>
+        </w:tc>
+      </w:tr>
+      <w:tr>
+        <w:tc>
+          <w:tcPr>
+            <w:tcW w:type="dxa" w:w="2592"/>
+            <w:vAlign w:val="center"/>
+            <w:tcBorders>
+              <w:top w:val="single" w:sz="4" w:color="D9D9D9"/>
+              <w:left w:val="single" w:sz="4" w:color="D9D9D9"/>
+              <w:bottom w:val="single" w:sz="4" w:color="D9D9D9"/>
+              <w:right w:val="single" w:sz="4" w:color="D9D9D9"/>
+            </w:tcBorders>
+          </w:tcPr>
+          <w:p>
+            <w:pPr>
+              <w:spacing w:after="80" w:before="80" w:line="240" w:lineRule="auto"/>
+            </w:pPr>
+            <w:r>
+              <w:rPr>
+                <w:b w:val="0"/>
+                <w:sz w:val="22"/>
+              </w:rPr>
+              <w:t>search</w:t>
+            </w:r>
+          </w:p>
+        </w:tc>
+        <w:tc>
+          <w:tcPr>
+            <w:tcW w:type="dxa" w:w="2016"/>
+            <w:vAlign w:val="center"/>
+            <w:tcBorders>
+              <w:top w:val="single" w:sz="4" w:color="D9D9D9"/>
+              <w:left w:val="single" w:sz="4" w:color="D9D9D9"/>
+              <w:bottom w:val="single" w:sz="4" w:color="D9D9D9"/>
+              <w:right w:val="single" w:sz="4" w:color="D9D9D9"/>
+            </w:tcBorders>
+          </w:tcPr>
+          <w:p>
+            <w:pPr>
+              <w:spacing w:after="80" w:before="80" w:line="240" w:lineRule="auto"/>
+            </w:pPr>
+            <w:r>
+              <w:rPr>
+                <w:b w:val="0"/>
+                <w:sz w:val="22"/>
+              </w:rPr>
+              <w:t>5/5</w:t>
+            </w:r>
+          </w:p>
+        </w:tc>
+        <w:tc>
+          <w:tcPr>
+            <w:tcW w:type="dxa" w:w="2016"/>
+            <w:vAlign w:val="center"/>
+            <w:tcBorders>
+              <w:top w:val="single" w:sz="4" w:color="D9D9D9"/>
+              <w:left w:val="single" w:sz="4" w:color="D9D9D9"/>
+              <w:bottom w:val="single" w:sz="4" w:color="D9D9D9"/>
+              <w:right w:val="single" w:sz="4" w:color="D9D9D9"/>
+            </w:tcBorders>
+          </w:tcPr>
+          <w:p>
+            <w:pPr>
+              <w:spacing w:after="80" w:before="80" w:line="240" w:lineRule="auto"/>
+            </w:pPr>
+            <w:r>
+              <w:rPr>
+                <w:b w:val="0"/>
+                <w:sz w:val="22"/>
+              </w:rPr>
+              <w:t>5/5</w:t>
+            </w:r>
+          </w:p>
+        </w:tc>
+        <w:tc>
+          <w:tcPr>
+            <w:tcW w:type="dxa" w:w="2016"/>
+            <w:vAlign w:val="center"/>
+            <w:tcBorders>
+              <w:top w:val="single" w:sz="4" w:color="D9D9D9"/>
+              <w:left w:val="single" w:sz="4" w:color="D9D9D9"/>
+              <w:bottom w:val="single" w:sz="4" w:color="D9D9D9"/>
+              <w:right w:val="single" w:sz="4" w:color="D9D9D9"/>
+            </w:tcBorders>
+          </w:tcPr>
+          <w:p>
+            <w:pPr>
+              <w:spacing w:after="80" w:before="80" w:line="240" w:lineRule="auto"/>
+            </w:pPr>
+            <w:r>
+              <w:rPr>
+                <w:b w:val="0"/>
+                <w:sz w:val="22"/>
+              </w:rPr>
+              <w:t>Đạt</w:t>
+            </w:r>
+          </w:p>
+        </w:tc>
+      </w:tr>
+      <w:tr>
+        <w:tc>
+          <w:tcPr>
+            <w:tcW w:type="dxa" w:w="2592"/>
+            <w:vAlign w:val="center"/>
+            <w:tcBorders>
+              <w:top w:val="single" w:sz="4" w:color="D9D9D9"/>
+              <w:left w:val="single" w:sz="4" w:color="D9D9D9"/>
+              <w:bottom w:val="single" w:sz="4" w:color="D9D9D9"/>
+              <w:right w:val="single" w:sz="4" w:color="D9D9D9"/>
+            </w:tcBorders>
+          </w:tcPr>
+          <w:p>
+            <w:pPr>
+              <w:spacing w:after="80" w:before="80" w:line="240" w:lineRule="auto"/>
+            </w:pPr>
+            <w:r>
+              <w:rPr>
+                <w:b w:val="0"/>
+                <w:sz w:val="22"/>
+              </w:rPr>
+              <w:t>bfs</w:t>
+            </w:r>
+          </w:p>
+        </w:tc>
+        <w:tc>
+          <w:tcPr>
+            <w:tcW w:type="dxa" w:w="2016"/>
+            <w:vAlign w:val="center"/>
+            <w:tcBorders>
+              <w:top w:val="single" w:sz="4" w:color="D9D9D9"/>
+              <w:left w:val="single" w:sz="4" w:color="D9D9D9"/>
+              <w:bottom w:val="single" w:sz="4" w:color="D9D9D9"/>
+              <w:right w:val="single" w:sz="4" w:color="D9D9D9"/>
+            </w:tcBorders>
+          </w:tcPr>
+          <w:p>
+            <w:pPr>
+              <w:spacing w:after="80" w:before="80" w:line="240" w:lineRule="auto"/>
+            </w:pPr>
+            <w:r>
+              <w:rPr>
+                <w:b w:val="0"/>
+                <w:sz w:val="22"/>
+              </w:rPr>
+              <w:t>7/7</w:t>
+            </w:r>
+          </w:p>
+        </w:tc>
+        <w:tc>
+          <w:tcPr>
+            <w:tcW w:type="dxa" w:w="2016"/>
+            <w:vAlign w:val="center"/>
+            <w:tcBorders>
+              <w:top w:val="single" w:sz="4" w:color="D9D9D9"/>
+              <w:left w:val="single" w:sz="4" w:color="D9D9D9"/>
+              <w:bottom w:val="single" w:sz="4" w:color="D9D9D9"/>
+              <w:right w:val="single" w:sz="4" w:color="D9D9D9"/>
+            </w:tcBorders>
+          </w:tcPr>
+          <w:p>
+            <w:pPr>
+              <w:spacing w:after="80" w:before="80" w:line="240" w:lineRule="auto"/>
+            </w:pPr>
+            <w:r>
+              <w:rPr>
+                <w:b w:val="0"/>
+                <w:sz w:val="22"/>
+              </w:rPr>
+              <w:t>7/7</w:t>
+            </w:r>
+          </w:p>
+        </w:tc>
+        <w:tc>
+          <w:tcPr>
+            <w:tcW w:type="dxa" w:w="2016"/>
+            <w:vAlign w:val="center"/>
+            <w:tcBorders>
+              <w:top w:val="single" w:sz="4" w:color="D9D9D9"/>
+              <w:left w:val="single" w:sz="4" w:color="D9D9D9"/>
+              <w:bottom w:val="single" w:sz="4" w:color="D9D9D9"/>
+              <w:right w:val="single" w:sz="4" w:color="D9D9D9"/>
+            </w:tcBorders>
+          </w:tcPr>
+          <w:p>
+            <w:pPr>
+              <w:spacing w:after="80" w:before="80" w:line="240" w:lineRule="auto"/>
+            </w:pPr>
+            <w:r>
+              <w:rPr>
+                <w:b w:val="0"/>
+                <w:sz w:val="22"/>
+              </w:rPr>
+              <w:t>Đạt</w:t>
+            </w:r>
+          </w:p>
+        </w:tc>
+      </w:tr>
+      <w:tr>
+        <w:tc>
+          <w:tcPr>
+            <w:tcW w:type="dxa" w:w="2592"/>
+            <w:vAlign w:val="center"/>
+            <w:tcBorders>
+              <w:top w:val="single" w:sz="4" w:color="D9D9D9"/>
+              <w:left w:val="single" w:sz="4" w:color="D9D9D9"/>
+              <w:bottom w:val="single" w:sz="4" w:color="D9D9D9"/>
+              <w:right w:val="single" w:sz="4" w:color="D9D9D9"/>
+            </w:tcBorders>
+          </w:tcPr>
+          <w:p>
+            <w:pPr>
+              <w:spacing w:after="80" w:before="80" w:line="240" w:lineRule="auto"/>
+            </w:pPr>
+            <w:r>
+              <w:rPr>
+                <w:b w:val="0"/>
+                <w:sz w:val="22"/>
+              </w:rPr>
+              <w:t>dp</w:t>
+            </w:r>
+          </w:p>
+        </w:tc>
+        <w:tc>
+          <w:tcPr>
+            <w:tcW w:type="dxa" w:w="2016"/>
+            <w:vAlign w:val="center"/>
+            <w:tcBorders>
+              <w:top w:val="single" w:sz="4" w:color="D9D9D9"/>
+              <w:left w:val="single" w:sz="4" w:color="D9D9D9"/>
+              <w:bottom w:val="single" w:sz="4" w:color="D9D9D9"/>
+              <w:right w:val="single" w:sz="4" w:color="D9D9D9"/>
+            </w:tcBorders>
+          </w:tcPr>
+          <w:p>
+            <w:pPr>
+              <w:spacing w:after="80" w:before="80" w:line="240" w:lineRule="auto"/>
+            </w:pPr>
+            <w:r>
+              <w:rPr>
+                <w:b w:val="0"/>
+                <w:sz w:val="22"/>
+              </w:rPr>
+              <w:t>12/12</w:t>
+            </w:r>
+          </w:p>
+        </w:tc>
+        <w:tc>
+          <w:tcPr>
+            <w:tcW w:type="dxa" w:w="2016"/>
+            <w:vAlign w:val="center"/>
+            <w:tcBorders>
+              <w:top w:val="single" w:sz="4" w:color="D9D9D9"/>
+              <w:left w:val="single" w:sz="4" w:color="D9D9D9"/>
+              <w:bottom w:val="single" w:sz="4" w:color="D9D9D9"/>
+              <w:right w:val="single" w:sz="4" w:color="D9D9D9"/>
+            </w:tcBorders>
+          </w:tcPr>
+          <w:p>
+            <w:pPr>
+              <w:spacing w:after="80" w:before="80" w:line="240" w:lineRule="auto"/>
+            </w:pPr>
+            <w:r>
+              <w:rPr>
+                <w:b w:val="0"/>
+                <w:sz w:val="22"/>
+              </w:rPr>
+              <w:t>12/12</w:t>
+            </w:r>
+          </w:p>
+        </w:tc>
+        <w:tc>
+          <w:tcPr>
+            <w:tcW w:type="dxa" w:w="2016"/>
+            <w:vAlign w:val="center"/>
+            <w:tcBorders>
+              <w:top w:val="single" w:sz="4" w:color="D9D9D9"/>
+              <w:left w:val="single" w:sz="4" w:color="D9D9D9"/>
+              <w:bottom w:val="single" w:sz="4" w:color="D9D9D9"/>
+              <w:right w:val="single" w:sz="4" w:color="D9D9D9"/>
+            </w:tcBorders>
+          </w:tcPr>
+          <w:p>
+            <w:pPr>
+              <w:spacing w:after="80" w:before="80" w:line="240" w:lineRule="auto"/>
+            </w:pPr>
+            <w:r>
+              <w:rPr>
+                <w:b w:val="0"/>
+                <w:sz w:val="22"/>
+              </w:rPr>
+              <w:t>Đạt</w:t>
+            </w:r>
+          </w:p>
+        </w:tc>
+      </w:tr>
+      <w:tr>
+        <w:tc>
+          <w:tcPr>
+            <w:tcW w:type="dxa" w:w="2592"/>
+            <w:vAlign w:val="center"/>
+            <w:tcBorders>
+              <w:top w:val="single" w:sz="4" w:color="D9D9D9"/>
+              <w:left w:val="single" w:sz="4" w:color="D9D9D9"/>
+              <w:bottom w:val="single" w:sz="4" w:color="D9D9D9"/>
+              <w:right w:val="single" w:sz="4" w:color="D9D9D9"/>
+            </w:tcBorders>
+          </w:tcPr>
+          <w:p>
+            <w:pPr>
+              <w:spacing w:after="80" w:before="80" w:line="240" w:lineRule="auto"/>
+            </w:pPr>
+            <w:r>
+              <w:rPr>
+                <w:b w:val="0"/>
+                <w:sz w:val="22"/>
+              </w:rPr>
+              <w:t>app</w:t>
+            </w:r>
+          </w:p>
+        </w:tc>
+        <w:tc>
+          <w:tcPr>
+            <w:tcW w:type="dxa" w:w="2016"/>
+            <w:vAlign w:val="center"/>
+            <w:tcBorders>
+              <w:top w:val="single" w:sz="4" w:color="D9D9D9"/>
+              <w:left w:val="single" w:sz="4" w:color="D9D9D9"/>
+              <w:bottom w:val="single" w:sz="4" w:color="D9D9D9"/>
+              <w:right w:val="single" w:sz="4" w:color="D9D9D9"/>
+            </w:tcBorders>
+          </w:tcPr>
+          <w:p>
+            <w:pPr>
+              <w:spacing w:after="80" w:before="80" w:line="240" w:lineRule="auto"/>
+            </w:pPr>
+            <w:r>
+              <w:rPr>
+                <w:b w:val="0"/>
+                <w:sz w:val="22"/>
+              </w:rPr>
+              <w:t>16/16</w:t>
+            </w:r>
+          </w:p>
+        </w:tc>
+        <w:tc>
+          <w:tcPr>
+            <w:tcW w:type="dxa" w:w="2016"/>
+            <w:vAlign w:val="center"/>
+            <w:tcBorders>
+              <w:top w:val="single" w:sz="4" w:color="D9D9D9"/>
+              <w:left w:val="single" w:sz="4" w:color="D9D9D9"/>
+              <w:bottom w:val="single" w:sz="4" w:color="D9D9D9"/>
+              <w:right w:val="single" w:sz="4" w:color="D9D9D9"/>
+            </w:tcBorders>
+          </w:tcPr>
+          <w:p>
+            <w:pPr>
+              <w:spacing w:after="80" w:before="80" w:line="240" w:lineRule="auto"/>
+            </w:pPr>
+            <w:r>
+              <w:rPr>
+                <w:b w:val="0"/>
+                <w:sz w:val="22"/>
+              </w:rPr>
+              <w:t>16/16</w:t>
+            </w:r>
+          </w:p>
+        </w:tc>
+        <w:tc>
+          <w:tcPr>
+            <w:tcW w:type="dxa" w:w="2016"/>
+            <w:vAlign w:val="center"/>
+            <w:tcBorders>
+              <w:top w:val="single" w:sz="4" w:color="D9D9D9"/>
+              <w:left w:val="single" w:sz="4" w:color="D9D9D9"/>
+              <w:bottom w:val="single" w:sz="4" w:color="D9D9D9"/>
+              <w:right w:val="single" w:sz="4" w:color="D9D9D9"/>
+            </w:tcBorders>
+          </w:tcPr>
+          <w:p>
+            <w:pPr>
+              <w:spacing w:after="80" w:before="80" w:line="240" w:lineRule="auto"/>
+            </w:pPr>
+            <w:r>
+              <w:rPr>
+                <w:b w:val="0"/>
+                <w:sz w:val="22"/>
+              </w:rPr>
+              <w:t>Đạt</w:t>
+            </w:r>
+          </w:p>
+        </w:tc>
+      </w:tr>
+      <w:tr>
+        <w:tc>
+          <w:tcPr>
+            <w:tcW w:type="dxa" w:w="2592"/>
+            <w:vAlign w:val="center"/>
+            <w:tcBorders>
+              <w:top w:val="single" w:sz="4" w:color="D9D9D9"/>
+              <w:left w:val="single" w:sz="4" w:color="D9D9D9"/>
+              <w:bottom w:val="single" w:sz="4" w:color="D9D9D9"/>
+              <w:right w:val="single" w:sz="4" w:color="D9D9D9"/>
+            </w:tcBorders>
+          </w:tcPr>
+          <w:p>
+            <w:pPr>
+              <w:spacing w:after="80" w:before="80" w:line="240" w:lineRule="auto"/>
+            </w:pPr>
+            <w:r>
+              <w:rPr>
+                <w:b w:val="0"/>
+                <w:sz w:val="22"/>
+              </w:rPr>
+              <w:t>all</w:t>
+            </w:r>
+          </w:p>
+        </w:tc>
+        <w:tc>
+          <w:tcPr>
+            <w:tcW w:type="dxa" w:w="2016"/>
+            <w:vAlign w:val="center"/>
+            <w:tcBorders>
+              <w:top w:val="single" w:sz="4" w:color="D9D9D9"/>
+              <w:left w:val="single" w:sz="4" w:color="D9D9D9"/>
+              <w:bottom w:val="single" w:sz="4" w:color="D9D9D9"/>
+              <w:right w:val="single" w:sz="4" w:color="D9D9D9"/>
+            </w:tcBorders>
+          </w:tcPr>
+          <w:p>
+            <w:pPr>
+              <w:spacing w:after="80" w:before="80" w:line="240" w:lineRule="auto"/>
+            </w:pPr>
+            <w:r>
+              <w:rPr>
+                <w:b w:val="0"/>
+                <w:sz w:val="22"/>
+              </w:rPr>
+              <w:t>60/60</w:t>
+            </w:r>
+          </w:p>
+        </w:tc>
+        <w:tc>
+          <w:tcPr>
+            <w:tcW w:type="dxa" w:w="2016"/>
+            <w:vAlign w:val="center"/>
+            <w:tcBorders>
+              <w:top w:val="single" w:sz="4" w:color="D9D9D9"/>
+              <w:left w:val="single" w:sz="4" w:color="D9D9D9"/>
+              <w:bottom w:val="single" w:sz="4" w:color="D9D9D9"/>
+              <w:right w:val="single" w:sz="4" w:color="D9D9D9"/>
+            </w:tcBorders>
+          </w:tcPr>
+          <w:p>
+            <w:pPr>
+              <w:spacing w:after="80" w:before="80" w:line="240" w:lineRule="auto"/>
+            </w:pPr>
+            <w:r>
+              <w:rPr>
+                <w:b w:val="0"/>
+                <w:sz w:val="22"/>
+              </w:rPr>
+              <w:t>60/60</w:t>
+            </w:r>
+          </w:p>
+        </w:tc>
+        <w:tc>
+          <w:tcPr>
+            <w:tcW w:type="dxa" w:w="2016"/>
+            <w:vAlign w:val="center"/>
+            <w:tcBorders>
+              <w:top w:val="single" w:sz="4" w:color="D9D9D9"/>
+              <w:left w:val="single" w:sz="4" w:color="D9D9D9"/>
+              <w:bottom w:val="single" w:sz="4" w:color="D9D9D9"/>
+              <w:right w:val="single" w:sz="4" w:color="D9D9D9"/>
+            </w:tcBorders>
+          </w:tcPr>
+          <w:p>
+            <w:pPr>
+              <w:spacing w:after="80" w:before="80" w:line="240" w:lineRule="auto"/>
+            </w:pPr>
+            <w:r>
+              <w:rPr>
+                <w:b w:val="0"/>
+                <w:sz w:val="22"/>
+              </w:rPr>
+              <w:t>Đạt</w:t>
+            </w:r>
+          </w:p>
+        </w:tc>
+      </w:tr>
+    </w:tbl>
     <w:p>
       <w:pPr>
         <w:pStyle w:val="Heading2"/>
         <w:keepNext/>
         <w:keepLines/>
+        <w:spacing w:after="120" w:line="252" w:lineRule="auto"/>
       </w:pPr>
       <w:r>
         <w:t>Câu hỏi cuối buổi</w:t>
@@ -783,6 +2133,7 @@
       <w:pPr>
         <w:keepNext/>
         <w:keepLines/>
+        <w:spacing w:after="120" w:line="252" w:lineRule="auto"/>
       </w:pPr>
       <w:r>
         <w:t>Q1. Vì sao không được dùng dãy đã sắp giảm theo lợi ích/τ để tìm kiếm nhị phân theo ID? Nêu tiền điều kiện của hàm tìm kiếm.</w:t>
@@ -791,15 +2142,17 @@
     <w:p>
       <w:pPr>
         <w:keepLines/>
+        <w:spacing w:after="120" w:line="252" w:lineRule="auto"/>
       </w:pPr>
       <w:r>
-        <w:t>Dãy giảm theo lợi ích/τ không bảo đảm ID tăng, nên loại nửa khoảng dựa trên ID có thể bỏ mất đơn cần tìm. Tiền điều kiện: danh mục sắp tăng theo Order.id và các ID duy nhất. Phải giữ danh mục ID riêng với dãy ưu tiên. Bộ mini tình cờ cùng thứ tự không chứng minh hai cách sắp tương đương.</w:t>
+        <w:t>Tìm kiếm nhị phân cần dựa vào quan hệ giữa khóa ở giữa và các khóa nằm hai phía. Khi sắp theo lợi ích/chi phí, ID có thể xuất hiện lộn xộn; quyết định bỏ nửa dãy theo ID khi đó không có cơ sở và có thể bỏ đúng đơn đang tìm. Vì vậy, danh mục đưa vào binary_search phải tăng theo Order.id, với ID duy nhất. Dãy ưu tiên chỉ dùng để xếp thứ tự xử lý; em giữ riêng danh mục ID để tra cứu.</w:t>
       </w:r>
     </w:p>
     <w:p>
       <w:pPr>
         <w:keepNext/>
         <w:keepLines/>
+        <w:spacing w:after="120" w:line="252" w:lineRule="auto"/>
       </w:pPr>
       <w:r>
         <w:t>Q2. Với đơn ID 2 tới điểm 4, phục vụ 1 và bản đồ mẫu, giải thích từng thành phần của thời gian thực hiện τ. BFS có tiếp tục cho thời gian ngắn nhất nếu các cạnh mang thời gian khác nhau không?</w:t>
@@ -808,15 +2161,17 @@
     <w:p>
       <w:pPr>
         <w:keepLines/>
+        <w:spacing w:after="120" w:line="252" w:lineRule="auto"/>
       </w:pPr>
       <w:r>
-        <w:t>ID 2 giao tới đỉnh 4: tuyến 1→2→4 có h = 2 cạnh; đi mất 2, về mất 2, phục vụ mất 1. Vậy τ = 2 × 2 + 1 = 5 đơn vị thời gian. BFS tối thiểu số cạnh; khi thời gian các cạnh khác nhau, tuyến ít cạnh nhất không nhất thiết nhanh nhất. Với trọng số không âm, có thể dùng Dijkstra để tìm tổng thời gian nhỏ nhất.</w:t>
+        <w:t>Đơn 2 cần đi từ kho 1 đến điểm 4 rồi trở lại kho. Tuyến 1→2→4 có 2 cạnh, nên lượt đi mất 2, lượt về mất 2; cộng 1 đơn vị phục vụ được τ = 5. BFS cho kết quả phù hợp vì các cạnh có cùng chi phí. Nếu mỗi cạnh có thời gian khác nhau, tối thiểu số cạnh chưa chắc tối thiểu thời gian; với trọng số không âm, có thể dùng Dijkstra và tính chi phí từ tổng trọng số đường đi.</w:t>
       </w:r>
     </w:p>
     <w:p>
       <w:pPr>
         <w:keepNext/>
         <w:keepLines/>
+        <w:spacing w:after="120" w:line="252" w:lineRule="auto"/>
       </w:pPr>
       <w:r>
         <w:t>Q3. Giải thích hai phương án tạo ô F(2,8) và vị trí của ô đó trong table Julia. Vì sao nhánh lấy đơn phải dùng hàng trước?</w:t>
@@ -825,15 +2180,17 @@
     <w:p>
       <w:pPr>
         <w:keepLines/>
+        <w:spacing w:after="120" w:line="252" w:lineRule="auto"/>
       </w:pPr>
       <w:r>
-        <w:t>Không lấy ID 2: F(1,8) = 6. Lấy ID 2: lợi ích 8 cộng F(1,8−5) = 6, tổng 14. Do đó F(2,8) = 14, lưu tại table[3,9]; hai ô tham chiếu là table[2,9] và table[2,4]. Nhánh lấy dùng hàng trước để chỉ xét các đơn trước ID 2, tránh chọn lại cùng đơn và biến bài toán thành ba lô không giới hạn.</w:t>
+        <w:t>Ô này xét hai khả năng đối với đơn 2. Bỏ đơn: dùng table[2,9] = F(1,8) = 6. Lấy đơn: còn 8−5 = 3 thời gian cho đơn trước đó, nhận 8 + table[2,4] = 8+6 = 14. Chọn giá trị lớn hơn nên F(2,8) = table[3,9] = 14. Hàng trước chỉ chứa nghiệm của i−1 đơn; dùng hàng đó bảo đảm đơn i không xuất hiện thêm lần nữa trong phần ngân sách còn lại, đúng ràng buộc ba lô 0/1.</w:t>
       </w:r>
     </w:p>
     <w:p>
       <w:pPr>
         <w:keepNext/>
         <w:keepLines/>
+        <w:spacing w:after="120" w:line="252" w:lineRule="auto"/>
       </w:pPr>
       <w:r>
         <w:t>Q4. Sau khi giao ID 1 rồi hoàn tác ngay, FIFO, ngăn xếp, tổng thời gian và tổng lợi ích phải thay đổi thế nào? Nêu một bất biến kiểm tra việc không mất hoặc lặp đơn.</w:t>
@@ -842,15 +2199,19 @@
     <w:p>
       <w:pPr>
         <w:keepLines/>
+        <w:spacing w:after="120" w:line="252" w:lineRule="auto"/>
       </w:pPr>
       <w:r>
-        <w:t>Ban đầu FIFO [1,2], Stack [], đã dùng/đã nhận = 0/0. Giao ID 1: FIFO [2], Stack [1], hai tổng = 3/6. Hoàn tác: lấy ID 1 khỏi đỉnh Stack, trả về đầu FIFO → [1,2], Stack [], hai tổng = 0/0. Bất biến: các ID chờ và đã giao không trùng nhau, không lặp trong mỗi cấu trúc; hợp của chúng bằng tập chọn {1,2}. Các tổng phải bằng tổng chi phí/lợi ích của các đơn đã giao.</w:t>
+        <w:t>Giao đơn 1 lấy phần tử đầu FIFO [1,2], để lại [2], đồng thời đẩy 1 vào Stack: [1]. Thời gian đã dùng là 3, lợi ích đã nhận là 6. Hoàn tác lấy 1 ở đỉnh Stack, đưa về đầu FIFO, trừ đúng 3 và 6; trạng thái trở lại FIFO [1,2], Stack rỗng, hai tổng bằng 0.</w:t>
+        <w:br/>
+        <w:t>Bất biến cần giữ: tập ID đang chờ và đã giao rời nhau, không chứa ID lặp, hợp của hai tập bằng tập đã chọn. Ngoài ra, spent và earned phải bằng tổng chi phí, lợi ích của các ID đã giao; spent không vượt B. Nhờ vậy có thể phát hiện mất đơn, giao trùng hoặc cập nhật sai tổng.</w:t>
       </w:r>
     </w:p>
     <w:p>
       <w:pPr>
         <w:keepNext/>
         <w:keepLines/>
+        <w:spacing w:after="120" w:line="252" w:lineRule="auto"/>
       </w:pPr>
       <w:r>
         <w:t>Q5. Cho biết độ phức tạp theo n,V,E,B của sắp xếp trộn, tìm kiếm nhị phân, BFS cốt lõi và DP bảng đầy đủ. Vì sao không thể khẳng định mọi BST đều tra cứu trong O(log n)?</w:t>
@@ -859,17 +2220,18 @@
     <w:p>
       <w:pPr>
         <w:keepLines/>
+        <w:spacing w:after="120" w:line="252" w:lineRule="auto"/>
       </w:pPr>
       <w:r>
-        <w:t>Với n đơn, V đỉnh, E cạnh và ngân sách B: Merge Sort O(n log n) thời gian; tìm kiếm nhị phân O(log n); BFS cốt lõi O(V + E); DP bảng đầy đủ O(nB) thời gian và bộ nhớ. BFS dùng O(V) bộ nhớ phụ, còn lưu mọi tuyến có thể cần O(V²).</w:t>
+        <w:t>Với n đơn, V đỉnh, E cạnh và ngân sách B: sắp xếp trộn cần O(n log n), tìm kiếm nhị phân cần O(log n), BFS cốt lõi cần O(V+E), DP bảng đầy đủ cần O(nB) thời gian. Bộ nhớ phụ tương ứng là O(n) cộng ngăn xếp O(log n), O(1), O(V), và O(nB); việc lưu mọi tuyến BFS còn thêm O(L), xấu nhất O(V²).</w:t>
         <w:br/>
-        <w:t>BST tra cứu O(h), h là chiều cao cây. Cây cân bằng có h = O(log n), nhưng BST thông thường có thể lệch thành chuỗi, h = O(n), nên không thể khẳng định mọi BST đều tra cứu O(log n).</w:t>
+        <w:t>BST tìm kiếm theo một đường từ gốc xuống nên chi phí là O(h), phụ thuộc chiều cao cây. Chỉ khi cây giữ được chiều cao O(log n) mới có bảo đảm tra cứu O(log n); BST thường có thể lệch với h = O(n). Tương tự, sắp đơn theo lợi ích/chi phí không bảo đảm nghiệm ba lô 0/1 tối ưu; trong bài, DP quyết định tập chọn và vét cạn dùng để kiểm chứng trên bộ nhỏ.</w:t>
       </w:r>
     </w:p>
     <w:sectPr>
       <w:footerReference w:type="default" r:id="rId9"/>
       <w:pgSz w:w="11906" w:h="16838"/>
-      <w:pgMar w:top="1134" w:right="1247" w:bottom="1152" w:left="1247" w:header="720" w:footer="432" w:gutter="0"/>
+      <w:pgMar w:top="1134" w:right="1247" w:bottom="1224" w:left="1247" w:header="720" w:footer="432" w:gutter="0"/>
       <w:cols w:space="720"/>
       <w:docGrid w:linePitch="360"/>
     </w:sectPr>
@@ -1260,7 +2622,7 @@
     </w:pPr>
     <w:rPr>
       <w:rFonts w:ascii="Times New Roman" w:hAnsi="Times New Roman" w:eastAsia="Times New Roman"/>
-      <w:sz w:val="28"/>
+      <w:sz w:val="24"/>
     </w:rPr>
   </w:style>
   <w:style w:type="paragraph" w:styleId="Header">

</xml_diff>